<commit_message>
v443.1.0: Rohakten bereinigen und BWA-Vergleich ergänzen
</commit_message>
<xml_diff>
--- a/testakten/hausarbeit-bgb-uebung-fortgeschrittene-pohlmann-leipzig-ss26-vertragsbruch-aufrechnung/11_zitierweise_methodenlehre_palandt_muekomm.docx
+++ b/testakten/hausarbeit-bgb-uebung-fortgeschrittene-pohlmann-leipzig-ss26-vertragsbruch-aufrechnung/11_zitierweise_methodenlehre_palandt_muekomm.docx
@@ -108,7 +108,7 @@
         <w:jc w:val="left"/>
       </w:pPr>
       <w:r>
-        <w:t>Palandt/Bearbeiter, § X BGB, Rn. Y.</w:t>
+        <w:t>Palandt/Bearbeiter, Paragraf  X BGB, Rn. Y.</w:t>
       </w:r>
     </w:p>
     <w:p>
@@ -124,7 +124,7 @@
         <w:jc w:val="left"/>
       </w:pPr>
       <w:r>
-        <w:t>Beispiel: Palandt/Grüneberg, § 387 BGB, Rn. 5.</w:t>
+        <w:t>Beispiel: Palandt/Grüneberg, Paragraf  387 BGB, Rn. 5.</w:t>
       </w:r>
     </w:p>
     <w:p>
@@ -165,7 +165,7 @@
         <w:jc w:val="left"/>
       </w:pPr>
       <w:r>
-        <w:t>MüKo/Bearbeiter, § X BGB, Rn. Y (Aufl., Jahr).</w:t>
+        <w:t>MüKo/Bearbeiter, Paragraf  X BGB, Rn. Y (Aufl., Jahr).</w:t>
       </w:r>
     </w:p>
     <w:p>
@@ -181,7 +181,7 @@
         <w:jc w:val="left"/>
       </w:pPr>
       <w:r>
-        <w:t>Beispiel: MüKo/Westermann, § 434 BGB, Rn. 12 (9. Aufl. 2023).</w:t>
+        <w:t>Beispiel: MüKo/Westermann, Paragraf  434 BGB, Rn. 12 (9. Aufl. 2023).</w:t>
       </w:r>
     </w:p>
     <w:p>
@@ -208,7 +208,7 @@
         <w:jc w:val="left"/>
       </w:pPr>
       <w:r>
-        <w:t>Staudinger/Bearbeiter, § X BGB, Rn. Y (Bearb. Jahr).</w:t>
+        <w:t>Staudinger/Bearbeiter, Paragraf  X BGB, Rn. Y (Bearb. Jahr).</w:t>
       </w:r>
     </w:p>
     <w:p>
@@ -501,7 +501,7 @@
         <w:jc w:val="left"/>
       </w:pPr>
       <w:r>
-        <w:t>§ 437 Nr. 2 BGB</w:t>
+        <w:t>Paragraf  437 Nr. 2 BGB</w:t>
       </w:r>
     </w:p>
     <w:p>
@@ -509,7 +509,7 @@
         <w:jc w:val="left"/>
       </w:pPr>
       <w:r>
-        <w:t>§ 322 Abs. 2 ZPO</w:t>
+        <w:t>Paragraf  322 Abs. 2 ZPO</w:t>
       </w:r>
     </w:p>
     <w:p>
@@ -525,7 +525,7 @@
         <w:jc w:val="left"/>
       </w:pPr>
       <w:r>
-        <w:t>Nie: „Das Gesetz sagt in § 437 BGB, dass ..."</w:t>
+        <w:t>Nie: „Das Gesetz sagt in Paragraf  437 BGB, dass ..."</w:t>
       </w:r>
     </w:p>
     <w:p/>
@@ -739,7 +739,7 @@
         <w:rPr>
           <w:i/>
         </w:rPr>
-        <w:t>„A hat gegen B einen Kaufpreisanspruch aus § 433 Abs. 2 BGB."</w:t>
+        <w:t>„A hat gegen B einen Kaufpreisanspruch aus Paragraf  433 Abs. 2 BGB."</w:t>
       </w:r>
     </w:p>
     <w:p>
@@ -840,25 +840,6 @@
         <w:t xml:space="preserve"> des eigenen Ergebnisses auf den Sachverhalt.</w:t>
       </w:r>
     </w:p>
-    <w:p>
-      <w:pPr>
-        <w:jc w:val="left"/>
-      </w:pPr>
-      <w:r>
-        <w:t>Beispiel (§ 389 BGB Rückwirkungsstreit):</w:t>
-      </w:r>
-    </w:p>
-    <w:p>
-      <w:pPr>
-        <w:ind w:left="567"/>
-      </w:pPr>
-      <w:r>
-        <w:rPr>
-          <w:i/>
-        </w:rPr>
-        <w:t>„Nach h. M. (BGH NJW 1976, 1258; Palandt/Grüneberg, § 389 Rn. 3; MüKo/Schlüter, § 389 Rn. 5) wirkt die Aufrechnung rückwirkend auf den Zeitpunkt der Aufrechnungslage. Demgegenüber schlägt Staudinger/Gursky, § 389 Rn. 15, vor, die Rückwirkung bei Drittinteressen teleologisch zu reduzieren. Der h. M. ist zu folgen, weil der Wortlaut des § 389 BGB eindeutig ist und die Rückwirkung gerade dem Schuldner zugutekommt. [Subsumtion auf SV]."</w:t>
-      </w:r>
-    </w:p>
     <w:p/>
     <w:p>
       <w:pPr>
@@ -956,7 +937,7 @@
         <w:jc w:val="left"/>
       </w:pPr>
       <w:r>
-        <w:t>Westermann, Harm Peter, in: Münchener Kommentar zum BGB, Bd. 3, §§ 433–534. 9. Aufl. C.H.Beck, München 2023.</w:t>
+        <w:t>Westermann, Harm Peter, in: Münchener Kommentar zum BGB, Bd. 3, Paragrafen  433–534. 9. Aufl. C.H.Beck, München 2023.</w:t>
       </w:r>
     </w:p>
     <w:p>

</xml_diff>

<commit_message>
v443.1.0: Rohakten, BWA-Vergleich und verlässliche PDF-Pakete
Fallakten bereinigt, BWA-Vergleich ergänzt, PDF- und ZIP-Auslieferung abgesichert. Lokale Inhalts-, Struktur-, Navigations- und Paketprüfungen bestanden.
</commit_message>
<xml_diff>
--- a/testakten/hausarbeit-bgb-uebung-fortgeschrittene-pohlmann-leipzig-ss26-vertragsbruch-aufrechnung/11_zitierweise_methodenlehre_palandt_muekomm.docx
+++ b/testakten/hausarbeit-bgb-uebung-fortgeschrittene-pohlmann-leipzig-ss26-vertragsbruch-aufrechnung/11_zitierweise_methodenlehre_palandt_muekomm.docx
@@ -108,7 +108,7 @@
         <w:jc w:val="left"/>
       </w:pPr>
       <w:r>
-        <w:t>Palandt/Bearbeiter, § X BGB, Rn. Y.</w:t>
+        <w:t>Palandt/Bearbeiter, Paragraf  X BGB, Rn. Y.</w:t>
       </w:r>
     </w:p>
     <w:p>
@@ -124,7 +124,7 @@
         <w:jc w:val="left"/>
       </w:pPr>
       <w:r>
-        <w:t>Beispiel: Palandt/Grüneberg, § 387 BGB, Rn. 5.</w:t>
+        <w:t>Beispiel: Palandt/Grüneberg, Paragraf  387 BGB, Rn. 5.</w:t>
       </w:r>
     </w:p>
     <w:p>
@@ -165,7 +165,7 @@
         <w:jc w:val="left"/>
       </w:pPr>
       <w:r>
-        <w:t>MüKo/Bearbeiter, § X BGB, Rn. Y (Aufl., Jahr).</w:t>
+        <w:t>MüKo/Bearbeiter, Paragraf  X BGB, Rn. Y (Aufl., Jahr).</w:t>
       </w:r>
     </w:p>
     <w:p>
@@ -181,7 +181,7 @@
         <w:jc w:val="left"/>
       </w:pPr>
       <w:r>
-        <w:t>Beispiel: MüKo/Westermann, § 434 BGB, Rn. 12 (9. Aufl. 2023).</w:t>
+        <w:t>Beispiel: MüKo/Westermann, Paragraf  434 BGB, Rn. 12 (9. Aufl. 2023).</w:t>
       </w:r>
     </w:p>
     <w:p>
@@ -208,7 +208,7 @@
         <w:jc w:val="left"/>
       </w:pPr>
       <w:r>
-        <w:t>Staudinger/Bearbeiter, § X BGB, Rn. Y (Bearb. Jahr).</w:t>
+        <w:t>Staudinger/Bearbeiter, Paragraf  X BGB, Rn. Y (Bearb. Jahr).</w:t>
       </w:r>
     </w:p>
     <w:p>
@@ -501,7 +501,7 @@
         <w:jc w:val="left"/>
       </w:pPr>
       <w:r>
-        <w:t>§ 437 Nr. 2 BGB</w:t>
+        <w:t>Paragraf  437 Nr. 2 BGB</w:t>
       </w:r>
     </w:p>
     <w:p>
@@ -509,7 +509,7 @@
         <w:jc w:val="left"/>
       </w:pPr>
       <w:r>
-        <w:t>§ 322 Abs. 2 ZPO</w:t>
+        <w:t>Paragraf  322 Abs. 2 ZPO</w:t>
       </w:r>
     </w:p>
     <w:p>
@@ -525,7 +525,7 @@
         <w:jc w:val="left"/>
       </w:pPr>
       <w:r>
-        <w:t>Nie: „Das Gesetz sagt in § 437 BGB, dass ..."</w:t>
+        <w:t>Nie: „Das Gesetz sagt in Paragraf  437 BGB, dass ..."</w:t>
       </w:r>
     </w:p>
     <w:p/>
@@ -739,7 +739,7 @@
         <w:rPr>
           <w:i/>
         </w:rPr>
-        <w:t>„A hat gegen B einen Kaufpreisanspruch aus § 433 Abs. 2 BGB."</w:t>
+        <w:t>„A hat gegen B einen Kaufpreisanspruch aus Paragraf  433 Abs. 2 BGB."</w:t>
       </w:r>
     </w:p>
     <w:p>
@@ -840,25 +840,6 @@
         <w:t xml:space="preserve"> des eigenen Ergebnisses auf den Sachverhalt.</w:t>
       </w:r>
     </w:p>
-    <w:p>
-      <w:pPr>
-        <w:jc w:val="left"/>
-      </w:pPr>
-      <w:r>
-        <w:t>Beispiel (§ 389 BGB Rückwirkungsstreit):</w:t>
-      </w:r>
-    </w:p>
-    <w:p>
-      <w:pPr>
-        <w:ind w:left="567"/>
-      </w:pPr>
-      <w:r>
-        <w:rPr>
-          <w:i/>
-        </w:rPr>
-        <w:t>„Nach h. M. (BGH NJW 1976, 1258; Palandt/Grüneberg, § 389 Rn. 3; MüKo/Schlüter, § 389 Rn. 5) wirkt die Aufrechnung rückwirkend auf den Zeitpunkt der Aufrechnungslage. Demgegenüber schlägt Staudinger/Gursky, § 389 Rn. 15, vor, die Rückwirkung bei Drittinteressen teleologisch zu reduzieren. Der h. M. ist zu folgen, weil der Wortlaut des § 389 BGB eindeutig ist und die Rückwirkung gerade dem Schuldner zugutekommt. [Subsumtion auf SV]."</w:t>
-      </w:r>
-    </w:p>
     <w:p/>
     <w:p>
       <w:pPr>
@@ -956,7 +937,7 @@
         <w:jc w:val="left"/>
       </w:pPr>
       <w:r>
-        <w:t>Westermann, Harm Peter, in: Münchener Kommentar zum BGB, Bd. 3, §§ 433–534. 9. Aufl. C.H.Beck, München 2023.</w:t>
+        <w:t>Westermann, Harm Peter, in: Münchener Kommentar zum BGB, Bd. 3, Paragrafen  433–534. 9. Aufl. C.H.Beck, München 2023.</w:t>
       </w:r>
     </w:p>
     <w:p>

</xml_diff>